<commit_message>
docs(manual): push tooling is on main (#133) — drop the pending-merge note
Per the CLAUDE.md keep-in-step rule: doc updated, .docx re-exported (rev 16).

Co-Authored-By: Claude Opus 5.5 (1M context) <noreply@anthropic.com>
</commit_message>
<xml_diff>
--- a/docs/RMBL-Knowledge-Commons-Manual.docx
+++ b/docs/RMBL-Knowledge-Commons-Manual.docx
@@ -2249,67 +2249,6 @@
       </w:r>
       <w:r>
         <w:t xml:space="preserve">: without it the sync matches by title and DOI and has merged different papers that share a title.</w:t>
-      </w:r>
-    </w:p>
-    <w:p>
-      <w:pPr/>
-      <w:r>
-        <w:rPr>
-          <w:i/>
-        </w:rPr>
-        <w:t xml:space="preserve">As of this writing, </w:t>
-      </w:r>
-      <w:r>
-        <w:rPr>
-          <w:rStyle w:val="CodeChar"/>
-          <w:i/>
-        </w:rPr>
-        <w:t xml:space="preserve">sync-stories-to-neon</w:t>
-      </w:r>
-      <w:r>
-        <w:rPr>
-          <w:i/>
-        </w:rPr>
-        <w:t xml:space="preserve">, </w:t>
-      </w:r>
-      <w:r>
-        <w:rPr>
-          <w:rStyle w:val="CodeChar"/>
-          <w:i/>
-        </w:rPr>
-        <w:t xml:space="preserve">sync-rels-to-neon</w:t>
-      </w:r>
-      <w:r>
-        <w:rPr>
-          <w:i/>
-        </w:rPr>
-        <w:t xml:space="preserve">, </w:t>
-      </w:r>
-      <w:r>
-        <w:rPr>
-          <w:rStyle w:val="CodeChar"/>
-          <w:i/>
-        </w:rPr>
-        <w:t xml:space="preserve">--match-by-id</w:t>
-      </w:r>
-      <w:r>
-        <w:rPr>
-          <w:i/>
-        </w:rPr>
-        <w:t xml:space="preserve"> and the transaction safeguards are on the </w:t>
-      </w:r>
-      <w:r>
-        <w:rPr>
-          <w:rStyle w:val="CodeChar"/>
-          <w:i/>
-        </w:rPr>
-        <w:t xml:space="preserve">fix/neon-push-tooling</w:t>
-      </w:r>
-      <w:r>
-        <w:rPr>
-          <w:i/>
-        </w:rPr>
-        <w:t xml:space="preserve"> branch, pending merge.</w:t>
       </w:r>
     </w:p>
     <w:p>

</xml_diff>